<commit_message>
WIP - mentes branch valtas elott
</commit_message>
<xml_diff>
--- a/DV GL Dokumentáció.docx
+++ b/DV GL Dokumentáció.docx
@@ -21,10 +21,12 @@
           <w:sz w:val="28"/>
           <w:szCs w:val="28"/>
         </w:rPr>
-        <w:t xml:space="preserve">Détári Viktória és </w:t>
-      </w:r>
-      <w:proofErr w:type="spellStart"/>
-      <w:r>
+        <w:t>Détári Viktória és Gebhardt Lilla</w:t>
+      </w:r>
+    </w:p>
+    <w:p>
+      <w:pPr>
+        <w:jc w:val="center"/>
         <w:rPr>
           <w:rFonts w:ascii="Times New Roman" w:hAnsi="Times New Roman" w:cs="Times New Roman"/>
           <w:b/>
@@ -32,30 +34,6 @@
           <w:sz w:val="28"/>
           <w:szCs w:val="28"/>
         </w:rPr>
-        <w:t>Gebhardt</w:t>
-      </w:r>
-      <w:proofErr w:type="spellEnd"/>
-      <w:r>
-        <w:rPr>
-          <w:rFonts w:ascii="Times New Roman" w:hAnsi="Times New Roman" w:cs="Times New Roman"/>
-          <w:b/>
-          <w:bCs/>
-          <w:sz w:val="28"/>
-          <w:szCs w:val="28"/>
-        </w:rPr>
-        <w:t xml:space="preserve"> Lilla</w:t>
-      </w:r>
-    </w:p>
-    <w:p>
-      <w:pPr>
-        <w:jc w:val="center"/>
-        <w:rPr>
-          <w:rFonts w:ascii="Times New Roman" w:hAnsi="Times New Roman" w:cs="Times New Roman"/>
-          <w:b/>
-          <w:bCs/>
-          <w:sz w:val="28"/>
-          <w:szCs w:val="28"/>
-        </w:rPr>
       </w:pPr>
     </w:p>
     <w:p>
@@ -824,7 +802,6 @@
         <w:pStyle w:val="NormlWeb"/>
         <w:ind w:left="360"/>
       </w:pPr>
-      <w:proofErr w:type="gramStart"/>
       <w:r>
         <w:rPr>
           <w:rFonts w:hAnsi="Symbol"/>
@@ -838,14 +815,7 @@
         <w:rPr>
           <w:rStyle w:val="Kiemels2"/>
         </w:rPr>
-        <w:t>Excel</w:t>
-      </w:r>
-      <w:proofErr w:type="gramEnd"/>
-      <w:r>
-        <w:rPr>
-          <w:rStyle w:val="Kiemels2"/>
-        </w:rPr>
-        <w:t xml:space="preserve"> táblázat készítése</w:t>
+        <w:t>Excel táblázat készítése</w:t>
       </w:r>
       <w:r>
         <w:t>:</w:t>
@@ -890,7 +860,6 @@
         <w:pStyle w:val="NormlWeb"/>
         <w:ind w:left="360"/>
       </w:pPr>
-      <w:proofErr w:type="gramStart"/>
       <w:r>
         <w:rPr>
           <w:rFonts w:hAnsi="Symbol"/>
@@ -904,28 +873,7 @@
         <w:rPr>
           <w:rStyle w:val="Kiemels2"/>
         </w:rPr>
-        <w:t>Kezdeti</w:t>
-      </w:r>
-      <w:proofErr w:type="gramEnd"/>
-      <w:r>
-        <w:rPr>
-          <w:rStyle w:val="Kiemels2"/>
-        </w:rPr>
-        <w:t xml:space="preserve"> weboldal kinézet lerajzolása </w:t>
-      </w:r>
-      <w:proofErr w:type="spellStart"/>
-      <w:r>
-        <w:rPr>
-          <w:rStyle w:val="Kiemels2"/>
-        </w:rPr>
-        <w:t>Paintben</w:t>
-      </w:r>
-      <w:proofErr w:type="spellEnd"/>
-      <w:r>
-        <w:rPr>
-          <w:rStyle w:val="Kiemels2"/>
-        </w:rPr>
-        <w:t xml:space="preserve"> (vagy más rajzolóban)</w:t>
+        <w:t>Kezdeti weboldal kinézet lerajzolása Paintben (vagy más rajzolóban)</w:t>
       </w:r>
       <w:r>
         <w:t>:</w:t>
@@ -1003,7 +951,6 @@
         <w:pStyle w:val="NormlWeb"/>
         <w:ind w:left="360"/>
       </w:pPr>
-      <w:proofErr w:type="gramStart"/>
       <w:r>
         <w:rPr>
           <w:rFonts w:hAnsi="Symbol"/>
@@ -1017,93 +964,64 @@
         <w:rPr>
           <w:rStyle w:val="Kiemels2"/>
         </w:rPr>
-        <w:t>Excel</w:t>
-      </w:r>
-      <w:proofErr w:type="gramEnd"/>
+        <w:t>Excel táblákból adatbázis készítése, ami a weboldalunkra api-val elküldi az adatokat</w:t>
+      </w:r>
       <w:r>
         <w:rPr>
           <w:rStyle w:val="Kiemels2"/>
         </w:rPr>
-        <w:t xml:space="preserve"> táblákból adatbázis készítése, ami a weboldalunkra </w:t>
-      </w:r>
-      <w:proofErr w:type="spellStart"/>
-      <w:r>
+        <w:t>(Lilla)</w:t>
+      </w:r>
+    </w:p>
+    <w:p>
+      <w:pPr>
+        <w:pStyle w:val="NormlWeb"/>
+        <w:ind w:left="360"/>
         <w:rPr>
           <w:rStyle w:val="Kiemels2"/>
         </w:rPr>
-        <w:t>api-val</w:t>
-      </w:r>
-      <w:proofErr w:type="spellEnd"/>
+      </w:pPr>
+      <w:r>
+        <w:rPr>
+          <w:rFonts w:hAnsi="Symbol"/>
+        </w:rPr>
+        <w:t></w:t>
+      </w:r>
+      <w:r>
+        <w:t xml:space="preserve">  </w:t>
+      </w:r>
       <w:r>
         <w:rPr>
           <w:rStyle w:val="Kiemels2"/>
         </w:rPr>
-        <w:t xml:space="preserve"> elküldi az adatokat</w:t>
+        <w:t>Weboldal kinézet megtervezésének folytatása</w:t>
       </w:r>
       <w:r>
         <w:rPr>
           <w:rStyle w:val="Kiemels2"/>
         </w:rPr>
-        <w:t>(Lilla)</w:t>
-      </w:r>
-    </w:p>
-    <w:p>
-      <w:pPr>
-        <w:pStyle w:val="NormlWeb"/>
-        <w:ind w:left="360"/>
+        <w:t>(Viki)</w:t>
+      </w:r>
+    </w:p>
+    <w:p>
+      <w:pPr>
+        <w:pStyle w:val="NormlWeb"/>
         <w:rPr>
           <w:rStyle w:val="Kiemels2"/>
         </w:rPr>
       </w:pPr>
-      <w:proofErr w:type="gramStart"/>
-      <w:r>
-        <w:rPr>
-          <w:rFonts w:hAnsi="Symbol"/>
-        </w:rPr>
-        <w:t></w:t>
-      </w:r>
-      <w:r>
-        <w:t xml:space="preserve">  </w:t>
-      </w:r>
-      <w:r>
+    </w:p>
+    <w:p>
+      <w:pPr>
+        <w:pStyle w:val="NormlWeb"/>
         <w:rPr>
           <w:rStyle w:val="Kiemels2"/>
         </w:rPr>
-        <w:t>Weboldal</w:t>
-      </w:r>
-      <w:proofErr w:type="gramEnd"/>
+      </w:pPr>
       <w:r>
         <w:rPr>
           <w:rStyle w:val="Kiemels2"/>
         </w:rPr>
-        <w:t xml:space="preserve"> kinézet megtervezésének folytatása</w:t>
-      </w:r>
-      <w:r>
-        <w:rPr>
-          <w:rStyle w:val="Kiemels2"/>
-        </w:rPr>
-        <w:t>(Viki)</w:t>
-      </w:r>
-    </w:p>
-    <w:p>
-      <w:pPr>
-        <w:pStyle w:val="NormlWeb"/>
-        <w:rPr>
-          <w:rStyle w:val="Kiemels2"/>
-        </w:rPr>
-      </w:pPr>
-    </w:p>
-    <w:p>
-      <w:pPr>
-        <w:pStyle w:val="NormlWeb"/>
-        <w:rPr>
-          <w:rStyle w:val="Kiemels2"/>
-        </w:rPr>
-      </w:pPr>
-      <w:r>
-        <w:rPr>
-          <w:rStyle w:val="Kiemels2"/>
-        </w:rPr>
         <w:t>2025.10.02 Cél</w:t>
       </w:r>
     </w:p>
@@ -1158,23 +1076,7 @@
           <w:b/>
           <w:bCs/>
         </w:rPr>
-        <w:t xml:space="preserve">Az </w:t>
-      </w:r>
-      <w:proofErr w:type="spellStart"/>
-      <w:r>
-        <w:rPr>
-          <w:b/>
-          <w:bCs/>
-        </w:rPr>
-        <w:t>api</w:t>
-      </w:r>
-      <w:proofErr w:type="spellEnd"/>
-      <w:r>
-        <w:rPr>
-          <w:b/>
-          <w:bCs/>
-        </w:rPr>
-        <w:t xml:space="preserve"> és az adatbázis összekötése</w:t>
+        <w:t>Az api és az adatbázis összekötése</w:t>
       </w:r>
     </w:p>
     <w:p>
@@ -1230,23 +1132,7 @@
           <w:b/>
           <w:bCs/>
         </w:rPr>
-        <w:t xml:space="preserve">Weboldal kinézetének </w:t>
-      </w:r>
-      <w:proofErr w:type="gramStart"/>
-      <w:r>
-        <w:rPr>
-          <w:b/>
-          <w:bCs/>
-        </w:rPr>
-        <w:t>javítása(</w:t>
-      </w:r>
-      <w:proofErr w:type="gramEnd"/>
-      <w:r>
-        <w:rPr>
-          <w:b/>
-          <w:bCs/>
-        </w:rPr>
-        <w:t>Lilla)</w:t>
+        <w:t>Weboldal kinézetének javítása(Lilla)</w:t>
       </w:r>
     </w:p>
     <w:p>
@@ -1282,23 +1168,7 @@
           <w:b/>
           <w:bCs/>
         </w:rPr>
-        <w:t xml:space="preserve">Meghívó -&gt; email küldés </w:t>
-      </w:r>
-      <w:proofErr w:type="gramStart"/>
-      <w:r>
-        <w:rPr>
-          <w:b/>
-          <w:bCs/>
-        </w:rPr>
-        <w:t>megoldása(</w:t>
-      </w:r>
-      <w:proofErr w:type="gramEnd"/>
-      <w:r>
-        <w:rPr>
-          <w:b/>
-          <w:bCs/>
-        </w:rPr>
-        <w:t>Lilla)</w:t>
+        <w:t>Meghívó -&gt; email küldés megoldása(Lilla)</w:t>
       </w:r>
     </w:p>
     <w:p>
@@ -1318,49 +1188,29 @@
           <w:b/>
           <w:bCs/>
         </w:rPr>
-        <w:t>WPF-</w:t>
-      </w:r>
-      <w:proofErr w:type="spellStart"/>
-      <w:r>
-        <w:rPr>
-          <w:b/>
-          <w:bCs/>
-        </w:rPr>
-        <w:t>ből</w:t>
-      </w:r>
-      <w:proofErr w:type="spellEnd"/>
-      <w:r>
-        <w:rPr>
-          <w:b/>
-          <w:bCs/>
-        </w:rPr>
-        <w:t xml:space="preserve"> </w:t>
-      </w:r>
-      <w:proofErr w:type="spellStart"/>
-      <w:r>
-        <w:rPr>
-          <w:b/>
-          <w:bCs/>
-        </w:rPr>
-        <w:t>formba</w:t>
-      </w:r>
-      <w:proofErr w:type="spellEnd"/>
-      <w:r>
-        <w:rPr>
-          <w:b/>
-          <w:bCs/>
-        </w:rPr>
-        <w:t>, teljes backend kapcsolattal (</w:t>
-      </w:r>
-      <w:proofErr w:type="spellStart"/>
-      <w:r>
-        <w:rPr>
-          <w:b/>
-          <w:bCs/>
-        </w:rPr>
-        <w:t>httpclient</w:t>
-      </w:r>
-      <w:proofErr w:type="spellEnd"/>
+        <w:t>WPF-ből formba</w:t>
+      </w:r>
+      <w:r>
+        <w:rPr>
+          <w:b/>
+          <w:bCs/>
+        </w:rPr>
+        <w:t>, teljes backend kapcsolattal (httpclient)</w:t>
+      </w:r>
+      <w:r>
+        <w:rPr>
+          <w:b/>
+          <w:bCs/>
+        </w:rPr>
+        <w:t xml:space="preserve"> (Lilla</w:t>
+      </w:r>
+      <w:r>
+        <w:rPr>
+          <w:b/>
+          <w:bCs/>
+        </w:rPr>
+        <w:t>, Viki</w:t>
+      </w:r>
       <w:r>
         <w:rPr>
           <w:b/>
@@ -1368,27 +1218,6 @@
         </w:rPr>
         <w:t>)</w:t>
       </w:r>
-      <w:r>
-        <w:rPr>
-          <w:b/>
-          <w:bCs/>
-        </w:rPr>
-        <w:t xml:space="preserve"> (Lilla</w:t>
-      </w:r>
-      <w:r>
-        <w:rPr>
-          <w:b/>
-          <w:bCs/>
-        </w:rPr>
-        <w:t>, Viki</w:t>
-      </w:r>
-      <w:r>
-        <w:rPr>
-          <w:b/>
-          <w:bCs/>
-        </w:rPr>
-        <w:t>)</w:t>
-      </w:r>
     </w:p>
     <w:p>
       <w:pPr>
@@ -1424,70 +1253,7 @@
           <w:b/>
           <w:bCs/>
         </w:rPr>
-        <w:t>202</w:t>
-      </w:r>
-      <w:r>
-        <w:rPr>
-          <w:b/>
-          <w:bCs/>
-        </w:rPr>
-        <w:t>6.01.16.</w:t>
-      </w:r>
-      <w:r>
-        <w:rPr>
-          <w:b/>
-          <w:bCs/>
-        </w:rPr>
-        <w:t xml:space="preserve"> </w:t>
-      </w:r>
-      <w:r>
-        <w:rPr>
-          <w:b/>
-          <w:bCs/>
-        </w:rPr>
-        <w:t>C</w:t>
-      </w:r>
-      <w:r>
-        <w:rPr>
-          <w:b/>
-          <w:bCs/>
-        </w:rPr>
-        <w:t>él</w:t>
-      </w:r>
-      <w:r>
-        <w:rPr>
-          <w:b/>
-          <w:bCs/>
-        </w:rPr>
-        <w:t>:</w:t>
-      </w:r>
-      <w:r>
-        <w:rPr>
-          <w:b/>
-          <w:bCs/>
-        </w:rPr>
-        <w:t xml:space="preserve"> 01.</w:t>
-      </w:r>
-      <w:r>
-        <w:rPr>
-          <w:b/>
-          <w:bCs/>
-        </w:rPr>
-        <w:t>22.</w:t>
-      </w:r>
-      <w:r>
-        <w:rPr>
-          <w:b/>
-          <w:bCs/>
-        </w:rPr>
-        <w:t>-r</w:t>
-      </w:r>
-      <w:r>
-        <w:rPr>
-          <w:b/>
-          <w:bCs/>
-        </w:rPr>
-        <w:t>e</w:t>
+        <w:t>2026.01.16. Cél: 01.22.-re</w:t>
       </w:r>
     </w:p>
     <w:p>
@@ -1568,6 +1334,91 @@
           <w:bCs/>
         </w:rPr>
         <w:t>Backend tesztesetek (Viki)</w:t>
+      </w:r>
+    </w:p>
+    <w:p>
+      <w:pPr>
+        <w:pStyle w:val="NormlWeb"/>
+        <w:rPr>
+          <w:b/>
+          <w:bCs/>
+        </w:rPr>
+      </w:pPr>
+    </w:p>
+    <w:p>
+      <w:pPr>
+        <w:pStyle w:val="NormlWeb"/>
+        <w:rPr>
+          <w:b/>
+          <w:bCs/>
+        </w:rPr>
+      </w:pPr>
+      <w:r>
+        <w:rPr>
+          <w:b/>
+          <w:bCs/>
+        </w:rPr>
+        <w:t>2026.01.30. Cél:2026.02.05-re</w:t>
+      </w:r>
+    </w:p>
+    <w:p>
+      <w:pPr>
+        <w:pStyle w:val="NormlWeb"/>
+        <w:numPr>
+          <w:ilvl w:val="0"/>
+          <w:numId w:val="11"/>
+        </w:numPr>
+        <w:rPr>
+          <w:b/>
+          <w:bCs/>
+        </w:rPr>
+      </w:pPr>
+      <w:r>
+        <w:rPr>
+          <w:b/>
+          <w:bCs/>
+        </w:rPr>
+        <w:t>Chat funkció készítése Socket.io-val (Gergő mondta)</w:t>
+      </w:r>
+    </w:p>
+    <w:p>
+      <w:pPr>
+        <w:pStyle w:val="NormlWeb"/>
+        <w:numPr>
+          <w:ilvl w:val="0"/>
+          <w:numId w:val="11"/>
+        </w:numPr>
+        <w:rPr>
+          <w:b/>
+          <w:bCs/>
+        </w:rPr>
+      </w:pPr>
+      <w:r>
+        <w:rPr>
+          <w:b/>
+          <w:bCs/>
+        </w:rPr>
+        <w:t>Elemek animálása pl. bejelentkezés tailwinddel</w:t>
+      </w:r>
+    </w:p>
+    <w:p>
+      <w:pPr>
+        <w:pStyle w:val="NormlWeb"/>
+        <w:numPr>
+          <w:ilvl w:val="0"/>
+          <w:numId w:val="11"/>
+        </w:numPr>
+        <w:rPr>
+          <w:b/>
+          <w:bCs/>
+        </w:rPr>
+      </w:pPr>
+      <w:r>
+        <w:rPr>
+          <w:b/>
+          <w:bCs/>
+        </w:rPr>
+        <w:t>tesztek elkészítése: Viki backend, Lilla frontend</w:t>
       </w:r>
     </w:p>
     <w:p>
@@ -2040,6 +1891,119 @@
     </w:lvl>
   </w:abstractNum>
   <w:abstractNum w:abstractNumId="3" w15:restartNumberingAfterBreak="0">
+    <w:nsid w:val="42DD56D7"/>
+    <w:multiLevelType w:val="hybridMultilevel"/>
+    <w:tmpl w:val="610EBC82"/>
+    <w:lvl w:ilvl="0" w:tplc="040E0001">
+      <w:start w:val="1"/>
+      <w:numFmt w:val="bullet"/>
+      <w:lvlText w:val=""/>
+      <w:lvlJc w:val="left"/>
+      <w:pPr>
+        <w:ind w:left="720" w:hanging="360"/>
+      </w:pPr>
+      <w:rPr>
+        <w:rFonts w:ascii="Symbol" w:hAnsi="Symbol" w:hint="default"/>
+      </w:rPr>
+    </w:lvl>
+    <w:lvl w:ilvl="1" w:tplc="040E0003" w:tentative="1">
+      <w:start w:val="1"/>
+      <w:numFmt w:val="bullet"/>
+      <w:lvlText w:val="o"/>
+      <w:lvlJc w:val="left"/>
+      <w:pPr>
+        <w:ind w:left="1440" w:hanging="360"/>
+      </w:pPr>
+      <w:rPr>
+        <w:rFonts w:ascii="Courier New" w:hAnsi="Courier New" w:cs="Courier New" w:hint="default"/>
+      </w:rPr>
+    </w:lvl>
+    <w:lvl w:ilvl="2" w:tplc="040E0005" w:tentative="1">
+      <w:start w:val="1"/>
+      <w:numFmt w:val="bullet"/>
+      <w:lvlText w:val=""/>
+      <w:lvlJc w:val="left"/>
+      <w:pPr>
+        <w:ind w:left="2160" w:hanging="360"/>
+      </w:pPr>
+      <w:rPr>
+        <w:rFonts w:ascii="Wingdings" w:hAnsi="Wingdings" w:hint="default"/>
+      </w:rPr>
+    </w:lvl>
+    <w:lvl w:ilvl="3" w:tplc="040E0001" w:tentative="1">
+      <w:start w:val="1"/>
+      <w:numFmt w:val="bullet"/>
+      <w:lvlText w:val=""/>
+      <w:lvlJc w:val="left"/>
+      <w:pPr>
+        <w:ind w:left="2880" w:hanging="360"/>
+      </w:pPr>
+      <w:rPr>
+        <w:rFonts w:ascii="Symbol" w:hAnsi="Symbol" w:hint="default"/>
+      </w:rPr>
+    </w:lvl>
+    <w:lvl w:ilvl="4" w:tplc="040E0003" w:tentative="1">
+      <w:start w:val="1"/>
+      <w:numFmt w:val="bullet"/>
+      <w:lvlText w:val="o"/>
+      <w:lvlJc w:val="left"/>
+      <w:pPr>
+        <w:ind w:left="3600" w:hanging="360"/>
+      </w:pPr>
+      <w:rPr>
+        <w:rFonts w:ascii="Courier New" w:hAnsi="Courier New" w:cs="Courier New" w:hint="default"/>
+      </w:rPr>
+    </w:lvl>
+    <w:lvl w:ilvl="5" w:tplc="040E0005" w:tentative="1">
+      <w:start w:val="1"/>
+      <w:numFmt w:val="bullet"/>
+      <w:lvlText w:val=""/>
+      <w:lvlJc w:val="left"/>
+      <w:pPr>
+        <w:ind w:left="4320" w:hanging="360"/>
+      </w:pPr>
+      <w:rPr>
+        <w:rFonts w:ascii="Wingdings" w:hAnsi="Wingdings" w:hint="default"/>
+      </w:rPr>
+    </w:lvl>
+    <w:lvl w:ilvl="6" w:tplc="040E0001" w:tentative="1">
+      <w:start w:val="1"/>
+      <w:numFmt w:val="bullet"/>
+      <w:lvlText w:val=""/>
+      <w:lvlJc w:val="left"/>
+      <w:pPr>
+        <w:ind w:left="5040" w:hanging="360"/>
+      </w:pPr>
+      <w:rPr>
+        <w:rFonts w:ascii="Symbol" w:hAnsi="Symbol" w:hint="default"/>
+      </w:rPr>
+    </w:lvl>
+    <w:lvl w:ilvl="7" w:tplc="040E0003" w:tentative="1">
+      <w:start w:val="1"/>
+      <w:numFmt w:val="bullet"/>
+      <w:lvlText w:val="o"/>
+      <w:lvlJc w:val="left"/>
+      <w:pPr>
+        <w:ind w:left="5760" w:hanging="360"/>
+      </w:pPr>
+      <w:rPr>
+        <w:rFonts w:ascii="Courier New" w:hAnsi="Courier New" w:cs="Courier New" w:hint="default"/>
+      </w:rPr>
+    </w:lvl>
+    <w:lvl w:ilvl="8" w:tplc="040E0005" w:tentative="1">
+      <w:start w:val="1"/>
+      <w:numFmt w:val="bullet"/>
+      <w:lvlText w:val=""/>
+      <w:lvlJc w:val="left"/>
+      <w:pPr>
+        <w:ind w:left="6480" w:hanging="360"/>
+      </w:pPr>
+      <w:rPr>
+        <w:rFonts w:ascii="Wingdings" w:hAnsi="Wingdings" w:hint="default"/>
+      </w:rPr>
+    </w:lvl>
+  </w:abstractNum>
+  <w:abstractNum w:abstractNumId="4" w15:restartNumberingAfterBreak="0">
     <w:nsid w:val="43961EF0"/>
     <w:multiLevelType w:val="multilevel"/>
     <w:tmpl w:val="3D729FEA"/>
@@ -2188,7 +2152,7 @@
       </w:rPr>
     </w:lvl>
   </w:abstractNum>
-  <w:abstractNum w:abstractNumId="4" w15:restartNumberingAfterBreak="0">
+  <w:abstractNum w:abstractNumId="5" w15:restartNumberingAfterBreak="0">
     <w:nsid w:val="53F5183C"/>
     <w:multiLevelType w:val="multilevel"/>
     <w:tmpl w:val="C2EA285C"/>
@@ -2333,7 +2297,7 @@
       </w:rPr>
     </w:lvl>
   </w:abstractNum>
-  <w:abstractNum w:abstractNumId="5" w15:restartNumberingAfterBreak="0">
+  <w:abstractNum w:abstractNumId="6" w15:restartNumberingAfterBreak="0">
     <w:nsid w:val="6384101F"/>
     <w:multiLevelType w:val="multilevel"/>
     <w:tmpl w:val="2A5084F2"/>
@@ -2482,7 +2446,7 @@
       </w:rPr>
     </w:lvl>
   </w:abstractNum>
-  <w:abstractNum w:abstractNumId="6" w15:restartNumberingAfterBreak="0">
+  <w:abstractNum w:abstractNumId="7" w15:restartNumberingAfterBreak="0">
     <w:nsid w:val="65147D97"/>
     <w:multiLevelType w:val="multilevel"/>
     <w:tmpl w:val="A61034EE"/>
@@ -2631,7 +2595,7 @@
       </w:rPr>
     </w:lvl>
   </w:abstractNum>
-  <w:abstractNum w:abstractNumId="7" w15:restartNumberingAfterBreak="0">
+  <w:abstractNum w:abstractNumId="8" w15:restartNumberingAfterBreak="0">
     <w:nsid w:val="66E51ABE"/>
     <w:multiLevelType w:val="hybridMultilevel"/>
     <w:tmpl w:val="E6C015C6"/>
@@ -2744,7 +2708,7 @@
       </w:rPr>
     </w:lvl>
   </w:abstractNum>
-  <w:abstractNum w:abstractNumId="8" w15:restartNumberingAfterBreak="0">
+  <w:abstractNum w:abstractNumId="9" w15:restartNumberingAfterBreak="0">
     <w:nsid w:val="695D5D0A"/>
     <w:multiLevelType w:val="multilevel"/>
     <w:tmpl w:val="0122CF8C"/>
@@ -2893,7 +2857,7 @@
       </w:rPr>
     </w:lvl>
   </w:abstractNum>
-  <w:abstractNum w:abstractNumId="9" w15:restartNumberingAfterBreak="0">
+  <w:abstractNum w:abstractNumId="10" w15:restartNumberingAfterBreak="0">
     <w:nsid w:val="72AB5A3A"/>
     <w:multiLevelType w:val="hybridMultilevel"/>
     <w:tmpl w:val="69E88358"/>
@@ -3007,16 +2971,16 @@
     </w:lvl>
   </w:abstractNum>
   <w:num w:numId="1">
-    <w:abstractNumId w:val="4"/>
+    <w:abstractNumId w:val="5"/>
   </w:num>
   <w:num w:numId="2">
-    <w:abstractNumId w:val="8"/>
+    <w:abstractNumId w:val="9"/>
   </w:num>
   <w:num w:numId="3">
-    <w:abstractNumId w:val="5"/>
+    <w:abstractNumId w:val="6"/>
   </w:num>
   <w:num w:numId="4">
-    <w:abstractNumId w:val="3"/>
+    <w:abstractNumId w:val="4"/>
   </w:num>
   <w:num w:numId="5">
     <w:abstractNumId w:val="2"/>
@@ -3025,16 +2989,19 @@
     <w:abstractNumId w:val="1"/>
   </w:num>
   <w:num w:numId="7">
-    <w:abstractNumId w:val="6"/>
+    <w:abstractNumId w:val="7"/>
   </w:num>
   <w:num w:numId="8">
     <w:abstractNumId w:val="0"/>
   </w:num>
   <w:num w:numId="9">
-    <w:abstractNumId w:val="9"/>
+    <w:abstractNumId w:val="10"/>
   </w:num>
   <w:num w:numId="10">
-    <w:abstractNumId w:val="7"/>
+    <w:abstractNumId w:val="8"/>
+  </w:num>
+  <w:num w:numId="11">
+    <w:abstractNumId w:val="3"/>
   </w:num>
 </w:numbering>
 </file>

</xml_diff>